<commit_message>
Add GitHub repo URL to LinkedIn article (md and docx)
</commit_message>
<xml_diff>
--- a/article/linkedin_article_v2.docx
+++ b/article/linkedin_article_v2.docx
@@ -5,70 +5,144 @@
     <w:p>
       <w:pPr>
         <w:pStyle w:val="Heading1"/>
-        <w:jc w:val="center"/>
       </w:pPr>
       <w:r>
         <w:t>Agentic AI as a Key to the Vault: Unlocking Legacy Eclipse Reservoir Models for Open-Source Simulation at Scale</w:t>
       </w:r>
     </w:p>
     <w:p>
-      <w:pPr>
-        <w:jc w:val="center"/>
-      </w:pPr>
       <w:r>
-        <w:t>────────────────────────────────────────────────────────────────────────</w:t>
+        <w:t>────────────────────────────────────────────────────────────</w:t>
       </w:r>
     </w:p>
     <w:p>
-      <w:pPr>
-        <w:jc w:val="left"/>
-      </w:pPr>
       <w:r>
-        <w:rPr>
-          <w:sz w:val="22"/>
-        </w:rPr>
-        <w:t>There are tens of thousands of reservoir simulation models sitting in the industry right now that nobody is running.  They are locked inside commercial software environments — Eclipse, tNavigator, CMG — that cost $50,000 to $150,000 per seat per year.  The models themselves are valuable: years of geological interpretation, history matching, and engineering calibration embedded in a DATA file. But the physics inside that file is inaccessible to anyone without the right licence on the right machine.</w:t>
+        <w:t>There are tens of thousands of reservoir simulation models sitting in the industry right</w:t>
       </w:r>
     </w:p>
     <w:p>
-      <w:pPr>
-        <w:jc w:val="left"/>
-      </w:pPr>
       <w:r>
-        <w:rPr>
-          <w:sz w:val="22"/>
-        </w:rPr>
-        <w:t>OPM Flow has been able to read Eclipse DATA decks natively for several years.  It runs on commodity hardware — a standard workstation or a laptop — uses CPU rather than GPU, and carries no licence cost.  The technical capability to unlock those models has existed. What has not existed, until now, is a practical workflow for doing it at scale.</w:t>
+        <w:t>now that nobody is running.  They are locked inside commercial software environments —</w:t>
       </w:r>
     </w:p>
     <w:p>
-      <w:pPr>
-        <w:jc w:val="left"/>
-      </w:pPr>
       <w:r>
-        <w:rPr>
-          <w:sz w:val="22"/>
-        </w:rPr>
-        <w:t>The barrier was never OPM's physics.  The barrier was the overhead.  A real-world commercial model is not a clean textbook input.  It has Eclipse-specific keywords that OPM does not recognise, aquifer connection blocks that reference inactive cells, proprietary identifiers throughout, and outputs that sit on a slightly different time axis than the reference.  Resolving those issues for a single model might take a senior reservoir engineer half a day of trial and error followed by three to five days of careful output comparison. Multiply that by a portfolio of 30 models and the project becomes a programme — one that rarely gets resourced because the commercial alternative, however expensive, is simply faster to keep paying for.</w:t>
+        <w:t>Eclipse, tNavigator, CMG — that cost $50,000 to $150,000 per seat per year.  The models</w:t>
       </w:r>
     </w:p>
     <w:p>
-      <w:pPr>
-        <w:jc w:val="left"/>
-      </w:pPr>
       <w:r>
-        <w:rPr>
-          <w:sz w:val="22"/>
-        </w:rPr>
-        <w:t>Agentic AI changes that equation.  Not by making OPM better — OPM is already good — but by making the conversion workflow fast enough, cheap enough, and reproducible enough to run at scale.  What I built here is a sequence of seven autonomous agents that take a legacy Eclipse model, convert it, validate every output against the commercial reference, run a forward prediction, and package the results.  Total engineer time: about 30 minutes to configure and review.  Total compute cost: a CPU and 37 minutes.</w:t>
+        <w:t>themselves are valuable: years of geological interpretation, history matching, and</w:t>
       </w:r>
     </w:p>
     <w:p>
-      <w:pPr>
-        <w:jc w:val="center"/>
-      </w:pPr>
       <w:r>
-        <w:t>────────────────────────────────────────────────────────────────────────</w:t>
+        <w:t>engineering calibration embedded in a DATA file. But the physics inside that file is</w:t>
+      </w:r>
+    </w:p>
+    <w:p>
+      <w:r>
+        <w:t>inaccessible to anyone without the right licence on the right machine.</w:t>
+      </w:r>
+    </w:p>
+    <w:p>
+      <w:r>
+        <w:t>OPM Flow has been able to read Eclipse DATA decks natively for several years.  It runs on</w:t>
+      </w:r>
+    </w:p>
+    <w:p>
+      <w:r>
+        <w:t>commodity hardware — a standard workstation or a laptop — uses CPU rather than GPU, and</w:t>
+      </w:r>
+    </w:p>
+    <w:p>
+      <w:r>
+        <w:t>carries no licence cost.  The technical capability to unlock those models has existed.</w:t>
+      </w:r>
+    </w:p>
+    <w:p>
+      <w:r>
+        <w:t>What has not existed, until now, is a practical workflow for doing it at scale.</w:t>
+      </w:r>
+    </w:p>
+    <w:p>
+      <w:r>
+        <w:t>The barrier was never OPM's physics.  The barrier was the overhead.  A real-world</w:t>
+      </w:r>
+    </w:p>
+    <w:p>
+      <w:r>
+        <w:t>commercial model is not a clean textbook input.  It has Eclipse-specific keywords that OPM</w:t>
+      </w:r>
+    </w:p>
+    <w:p>
+      <w:r>
+        <w:t>does not recognise, aquifer connection blocks that reference inactive cells, proprietary</w:t>
+      </w:r>
+    </w:p>
+    <w:p>
+      <w:r>
+        <w:t>identifiers throughout, and outputs that sit on a slightly different time axis than the</w:t>
+      </w:r>
+    </w:p>
+    <w:p>
+      <w:r>
+        <w:t>reference.  Resolving those issues for a single model might take a senior reservoir engineer</w:t>
+      </w:r>
+    </w:p>
+    <w:p>
+      <w:r>
+        <w:t>half a day of trial and error followed by three to five days of careful output comparison.</w:t>
+      </w:r>
+    </w:p>
+    <w:p>
+      <w:r>
+        <w:t>Multiply that by a portfolio of 30 models and the project becomes a programme — one that</w:t>
+      </w:r>
+    </w:p>
+    <w:p>
+      <w:r>
+        <w:t>rarely gets resourced because the commercial alternative, however expensive, is simply</w:t>
+      </w:r>
+    </w:p>
+    <w:p>
+      <w:r>
+        <w:t>faster to keep paying for.</w:t>
+      </w:r>
+    </w:p>
+    <w:p>
+      <w:r>
+        <w:t>Agentic AI changes that equation.  Not by making OPM better — OPM is already good — but</w:t>
+      </w:r>
+    </w:p>
+    <w:p>
+      <w:r>
+        <w:t>by making the conversion workflow fast enough, cheap enough, and reproducible enough to</w:t>
+      </w:r>
+    </w:p>
+    <w:p>
+      <w:r>
+        <w:t>run at scale.  What I built here is a sequence of seven autonomous agents that take a</w:t>
+      </w:r>
+    </w:p>
+    <w:p>
+      <w:r>
+        <w:t>legacy Eclipse model, convert it, validate every output against the commercial reference,</w:t>
+      </w:r>
+    </w:p>
+    <w:p>
+      <w:r>
+        <w:t>run a forward prediction, and package the results.  Total engineer time: about 30 minutes</w:t>
+      </w:r>
+    </w:p>
+    <w:p>
+      <w:r>
+        <w:t>to configure and review.  Total compute cost: a CPU and 37 minutes.</w:t>
+      </w:r>
+    </w:p>
+    <w:p>
+      <w:r>
+        <w:t>────────────────────────────────────────────────────────────</w:t>
       </w:r>
     </w:p>
     <w:p>
@@ -80,91 +154,154 @@
       </w:r>
     </w:p>
     <w:p>
-      <w:pPr>
-        <w:jc w:val="left"/>
-      </w:pPr>
       <w:r>
-        <w:rPr>
-          <w:sz w:val="22"/>
-        </w:rPr>
-        <w:t>The workflow is a means, not an end.  Before getting into how it works, it is worth being concrete about the situations where removing the licence barrier actually matters.</w:t>
+        <w:t>The workflow is a means, not an end.  Before getting into how it works, it is worth</w:t>
       </w:r>
     </w:p>
     <w:p>
-      <w:pPr>
-        <w:jc w:val="left"/>
-      </w:pPr>
       <w:r>
-        <w:rPr>
-          <w:sz w:val="22"/>
-        </w:rPr>
+        <w:t>being concrete about the situations where removing the licence barrier actually matters.</w:t>
       </w:r>
+    </w:p>
+    <w:p>
+      <w:r/>
       <w:r>
         <w:rPr>
           <w:b/>
-          <w:sz w:val="22"/>
         </w:rPr>
         <w:t>Virtual data rooms during asset transactions.</w:t>
       </w:r>
       <w:r>
-        <w:rPr>
-          <w:sz w:val="22"/>
-        </w:rPr>
-        <w:t xml:space="preserve">  When a buyer's technical team reviews an asset in a VDR, they typically get access to the simulation files but not the software to run them.  Eclipse licences are not portable and the seller's IT environment is closed. With OPM, the buyer's team can run the model on their own hardware — a laptop with WSL is sufficient — within the VDR period.  That means running sensitivities on the seller's forecast, stress-testing their assumptions, and forming an independent view on reserves before exclusivity.  Today, many buyers are limited to reading the static outputs the seller chose to share.  That is a material information asymmetry that OPM can close.</w:t>
+        <w:t xml:space="preserve">  When a buyer's technical team reviews an</w:t>
       </w:r>
     </w:p>
     <w:p>
-      <w:pPr>
-        <w:jc w:val="left"/>
-      </w:pPr>
       <w:r>
-        <w:rPr>
-          <w:sz w:val="22"/>
-        </w:rPr>
+        <w:t>asset in a VDR, they typically get access to the simulation files but not the software to</w:t>
       </w:r>
+    </w:p>
+    <w:p>
+      <w:r>
+        <w:t>run them.  Eclipse licences are not portable and the seller's IT environment is closed.</w:t>
+      </w:r>
+    </w:p>
+    <w:p>
+      <w:r>
+        <w:t>With OPM, the buyer's team can run the model on their own hardware — a laptop with WSL is</w:t>
+      </w:r>
+    </w:p>
+    <w:p>
+      <w:r>
+        <w:t>sufficient — within the VDR period.  That means running sensitivities on the seller's</w:t>
+      </w:r>
+    </w:p>
+    <w:p>
+      <w:r>
+        <w:t>forecast, stress-testing their assumptions, and forming an independent view on reserves</w:t>
+      </w:r>
+    </w:p>
+    <w:p>
+      <w:r>
+        <w:t>before exclusivity.  Today, many buyers are limited to reading the static outputs the seller</w:t>
+      </w:r>
+    </w:p>
+    <w:p>
+      <w:r>
+        <w:t>chose to share.  That is a material information asymmetry that OPM can close.</w:t>
+      </w:r>
+    </w:p>
+    <w:p>
+      <w:r/>
       <w:r>
         <w:rPr>
           <w:b/>
-          <w:sz w:val="22"/>
         </w:rPr>
         <w:t>Post-acquisition data harmonisation.</w:t>
       </w:r>
       <w:r>
-        <w:rPr>
-          <w:sz w:val="22"/>
-        </w:rPr>
-        <w:t xml:space="preserve">  After an acquisition, an operator inherits models built in whatever simulators the previous owner used.  Portfolios of 20 or 30 models in mixed platforms — Eclipse, tNavigator, older Petrel versions — are common.  Re-licensing or standardising onto one commercial platform takes months and costs.  OPM provides a bridge: run the inherited Eclipse decks as-is, extract consistent outputs, and integrate the results into the new operator's portfolio reporting immediately.  The legacy models do not need to be converted — they just need to be validated once.</w:t>
+        <w:t xml:space="preserve">  After an acquisition, an operator inherits models</w:t>
       </w:r>
     </w:p>
     <w:p>
-      <w:pPr>
-        <w:jc w:val="left"/>
-      </w:pPr>
       <w:r>
-        <w:rPr>
-          <w:sz w:val="22"/>
-        </w:rPr>
+        <w:t>built in whatever simulators the previous owner used.  Portfolios of 20 or 30 models in</w:t>
       </w:r>
+    </w:p>
+    <w:p>
+      <w:r>
+        <w:t>mixed platforms — Eclipse, tNavigator, older Petrel versions — are common.  Re-licensing</w:t>
+      </w:r>
+    </w:p>
+    <w:p>
+      <w:r>
+        <w:t>or standardising onto one commercial platform takes months and costs.  OPM provides a</w:t>
+      </w:r>
+    </w:p>
+    <w:p>
+      <w:r>
+        <w:t>bridge: run the inherited Eclipse decks as-is, extract consistent outputs, and integrate</w:t>
+      </w:r>
+    </w:p>
+    <w:p>
+      <w:r>
+        <w:t>the results into the new operator's portfolio reporting immediately.  The legacy models do</w:t>
+      </w:r>
+    </w:p>
+    <w:p>
+      <w:r>
+        <w:t>not need to be converted — they just need to be validated once.</w:t>
+      </w:r>
+    </w:p>
+    <w:p>
+      <w:r/>
       <w:r>
         <w:rPr>
           <w:b/>
-          <w:sz w:val="22"/>
         </w:rPr>
         <w:t>Independent regulatory and reserves audit.</w:t>
       </w:r>
       <w:r>
-        <w:rPr>
-          <w:sz w:val="22"/>
-        </w:rPr>
-        <w:t xml:space="preserve">  National oil companies and regulators in a growing number of jurisdictions are moving toward independently reproducible simulation runs as part of field development plan submissions or reserves certification.  A commercial simulator is a black box to the regulator: they can see inputs and outputs but not the solver.  OPM's open-source codebase changes that.  A technically capable third party can inspect not just what the model says but how the mathematics were applied.  For technically complex submissions — gas reservoir depletion, complex aquifer behaviour, EOR schemes — that level of transparency is increasingly being asked for.</w:t>
+        <w:t xml:space="preserve">  National oil companies and regulators in a</w:t>
       </w:r>
     </w:p>
     <w:p>
-      <w:pPr>
-        <w:jc w:val="center"/>
-      </w:pPr>
       <w:r>
-        <w:t>────────────────────────────────────────────────────────────────────────</w:t>
+        <w:t>growing number of jurisdictions are moving toward independently reproducible simulation</w:t>
+      </w:r>
+    </w:p>
+    <w:p>
+      <w:r>
+        <w:t>runs as part of field development plan submissions or reserves certification.  A commercial</w:t>
+      </w:r>
+    </w:p>
+    <w:p>
+      <w:r>
+        <w:t>simulator is a black box to the regulator: they can see inputs and outputs but not the</w:t>
+      </w:r>
+    </w:p>
+    <w:p>
+      <w:r>
+        <w:t>solver.  OPM's open-source codebase changes that.  A technically capable third party can</w:t>
+      </w:r>
+    </w:p>
+    <w:p>
+      <w:r>
+        <w:t>inspect not just what the model says but how the mathematics were applied.  For</w:t>
+      </w:r>
+    </w:p>
+    <w:p>
+      <w:r>
+        <w:t>technically complex submissions — gas reservoir depletion, complex aquifer behaviour, EOR</w:t>
+      </w:r>
+    </w:p>
+    <w:p>
+      <w:r>
+        <w:t>schemes — that level of transparency is increasingly being asked for.</w:t>
+      </w:r>
+    </w:p>
+    <w:p>
+      <w:r>
+        <w:t>────────────────────────────────────────────────────────────</w:t>
       </w:r>
     </w:p>
     <w:p>
@@ -176,258 +313,399 @@
       </w:r>
     </w:p>
     <w:p>
-      <w:pPr>
-        <w:jc w:val="left"/>
-      </w:pPr>
       <w:r>
-        <w:rPr>
-          <w:sz w:val="22"/>
-        </w:rPr>
-        <w:t>The workflow runs seven Python scripts, each invoked in sequence by an orchestrator. Every agent writes its outputs to a shared directory and reads its inputs from the same place.  Nothing is passed in memory between agents — only files.  This design means any agent can be re-run in isolation for debugging, and the workflow can be interrupted and resumed at any step.</w:t>
+        <w:t>The workflow runs seven Python scripts, each invoked in sequence by an orchestrator.</w:t>
       </w:r>
     </w:p>
     <w:p>
-      <w:pPr>
-        <w:jc w:val="left"/>
-      </w:pPr>
       <w:r>
-        <w:rPr>
-          <w:sz w:val="22"/>
-        </w:rPr>
+        <w:t>Every agent writes its outputs to a shared directory and reads its inputs from the same</w:t>
       </w:r>
+    </w:p>
+    <w:p>
+      <w:r>
+        <w:t>place.  Nothing is passed in memory between agents — only files.  This design means any</w:t>
+      </w:r>
+    </w:p>
+    <w:p>
+      <w:r>
+        <w:t>agent can be re-run in isolation for debugging, and the workflow can be interrupted and</w:t>
+      </w:r>
+    </w:p>
+    <w:p>
+      <w:r>
+        <w:t>resumed at any step.</w:t>
+      </w:r>
+    </w:p>
+    <w:p>
+      <w:r/>
       <w:r>
         <w:rPr>
           <w:b/>
-          <w:sz w:val="22"/>
         </w:rPr>
         <w:t>Agent 1 — Environment check.</w:t>
       </w:r>
       <w:r>
-        <w:rPr>
-          <w:sz w:val="22"/>
-        </w:rPr>
-        <w:t xml:space="preserve">  Before committing time to a simulation run, the first thing the agent does is verify that OPM Flow is installed (</w:t>
-      </w:r>
-      <w:r>
-        <w:rPr>
-          <w:rFonts w:ascii="Courier New" w:hAnsi="Courier New"/>
-          <w:sz w:val="22"/>
-        </w:rPr>
-        <w:t>wsl flow --version</w:t>
-      </w:r>
-      <w:r>
-        <w:rPr>
-          <w:sz w:val="22"/>
-        </w:rPr>
-        <w:t>), that all required Python packages are importable, and that the DATA file exists at the configured path.  This is a fail-fast check.  The reason it exists as a separate agent rather than being part of the run step is that environment failures have a completely different character from simulation failures — they are fixed by installing software, not by editing the model — and surfacing them immediately saves the user from waiting through a long run only to hit an import error at the end.</w:t>
+        <w:t xml:space="preserve">  Before committing time to a simulation run, the first</w:t>
       </w:r>
     </w:p>
     <w:p>
-      <w:pPr>
-        <w:jc w:val="left"/>
-      </w:pPr>
       <w:r>
-        <w:rPr>
-          <w:sz w:val="22"/>
-        </w:rPr>
+        <w:t>thing the agent does is verify that OPM Flow is installed (`wsl flow --version`), that all</w:t>
       </w:r>
+    </w:p>
+    <w:p>
+      <w:r>
+        <w:t>required Python packages are importable, and that the DATA file exists at the configured</w:t>
+      </w:r>
+    </w:p>
+    <w:p>
+      <w:r>
+        <w:t>path.  This is a fail-fast check.  The reason it exists as a separate agent rather than</w:t>
+      </w:r>
+    </w:p>
+    <w:p>
+      <w:r>
+        <w:t>being part of the run step is that environment failures have a completely different</w:t>
+      </w:r>
+    </w:p>
+    <w:p>
+      <w:r>
+        <w:t>character from simulation failures — they are fixed by installing software, not by editing</w:t>
+      </w:r>
+    </w:p>
+    <w:p>
+      <w:r>
+        <w:t>the model — and surfacing them immediately saves the user from waiting through a long run</w:t>
+      </w:r>
+    </w:p>
+    <w:p>
+      <w:r>
+        <w:t>only to hit an import error at the end.</w:t>
+      </w:r>
+    </w:p>
+    <w:p>
+      <w:r/>
       <w:r>
         <w:rPr>
           <w:b/>
-          <w:sz w:val="22"/>
         </w:rPr>
         <w:t>Agent 2 — Run OPM Flow.</w:t>
       </w:r>
       <w:r>
-        <w:rPr>
-          <w:sz w:val="22"/>
-        </w:rPr>
-        <w:t xml:space="preserve">  The agent constructs the OPM command with two flags that are non-obvious but important.  </w:t>
-      </w:r>
-      <w:r>
-        <w:rPr>
-          <w:rFonts w:ascii="Courier New" w:hAnsi="Courier New"/>
-          <w:sz w:val="22"/>
-        </w:rPr>
-        <w:t>--parsing-strictness=low</w:t>
-      </w:r>
-      <w:r>
-        <w:rPr>
-          <w:sz w:val="22"/>
-        </w:rPr>
-        <w:t xml:space="preserve"> tells OPM to accept Eclipse keywords it does not recognise rather than aborting — without it, the simulator exits immediately on the first unknown keyword, which for a real-world commercial model is usually within the first 50 lines.  </w:t>
-      </w:r>
-      <w:r>
-        <w:rPr>
-          <w:rFonts w:ascii="Courier New" w:hAnsi="Courier New"/>
-          <w:sz w:val="22"/>
-        </w:rPr>
-        <w:t>--max-single-precision-days=0</w:t>
-      </w:r>
-      <w:r>
-        <w:rPr>
-          <w:sz w:val="22"/>
-        </w:rPr>
-        <w:t xml:space="preserve"> forces double-precision arithmetic throughout; OPM's default is to switch to single precision after a threshold, which degrades pressure accuracy.  The agent streams the PRT output line-by-line as the run progresses so the user can watch convergence in real time, and writes a convergence summary (Newton iterations per timestep, retried steps) to a JSON file for the performance dashboard.</w:t>
+        <w:t xml:space="preserve">  The agent constructs the OPM command with two flags that are</w:t>
       </w:r>
     </w:p>
     <w:p>
-      <w:pPr>
-        <w:jc w:val="left"/>
-      </w:pPr>
       <w:r>
-        <w:rPr>
-          <w:sz w:val="22"/>
-        </w:rPr>
+        <w:t>non-obvious but important.  `--parsing-strictness=low` tells OPM to accept Eclipse keywords</w:t>
       </w:r>
+    </w:p>
+    <w:p>
+      <w:r>
+        <w:t>it does not recognise rather than aborting — without it, the simulator exits immediately on</w:t>
+      </w:r>
+    </w:p>
+    <w:p>
+      <w:r>
+        <w:t>the first unknown keyword, which for a real-world commercial model is usually within the</w:t>
+      </w:r>
+    </w:p>
+    <w:p>
+      <w:r>
+        <w:t>first 50 lines.  `--max-single-precision-days=0` forces double-precision arithmetic</w:t>
+      </w:r>
+    </w:p>
+    <w:p>
+      <w:r>
+        <w:t>throughout; OPM's default is to switch to single precision after a threshold, which</w:t>
+      </w:r>
+    </w:p>
+    <w:p>
+      <w:r>
+        <w:t>degrades pressure accuracy.  The agent streams the PRT output line-by-line as the run</w:t>
+      </w:r>
+    </w:p>
+    <w:p>
+      <w:r>
+        <w:t>progresses so the user can watch convergence in real time, and writes a convergence</w:t>
+      </w:r>
+    </w:p>
+    <w:p>
+      <w:r>
+        <w:t>summary (Newton iterations per timestep, retried steps) to a JSON file for the</w:t>
+      </w:r>
+    </w:p>
+    <w:p>
+      <w:r>
+        <w:t>performance dashboard.</w:t>
+      </w:r>
+    </w:p>
+    <w:p>
+      <w:r/>
       <w:r>
         <w:rPr>
           <w:b/>
-          <w:sz w:val="22"/>
         </w:rPr>
         <w:t>Agent 3 — Parse and align outputs.</w:t>
       </w:r>
       <w:r>
-        <w:rPr>
-          <w:sz w:val="22"/>
-        </w:rPr>
-        <w:t xml:space="preserve">  This is where most of the technical complexity lives.  OPM and Eclipse produce their output on slightly different time axes: OPM's UNSMRY integration accumulates floating-point rounding differently from Eclipse's, and the INTEHEAD date integers in the UNRST binary need to be decoded and matched to Eclipse's restart schedule.  The agent handles both — linearly interpolating the OPM UNSMRY vectors onto Eclipse's 127-point time axis, and optionally loading Eclipse's UNRST binary for cell-level comparison if supplied.  It then serialises everything to a single </w:t>
-      </w:r>
-      <w:r>
-        <w:rPr>
-          <w:rFonts w:ascii="Courier New" w:hAnsi="Courier New"/>
-          <w:sz w:val="22"/>
-        </w:rPr>
-        <w:t>.npz</w:t>
-      </w:r>
-      <w:r>
-        <w:rPr>
-          <w:sz w:val="22"/>
-        </w:rPr>
-        <w:t xml:space="preserve"> file. The reason for serialising rather than keeping arrays in memory is that downstream agents need to be restartable: if the visualisation step fails, you do not want to re-run the parser.</w:t>
+        <w:t xml:space="preserve">  This is where most of the technical complexity</w:t>
       </w:r>
     </w:p>
     <w:p>
-      <w:pPr>
-        <w:jc w:val="left"/>
-      </w:pPr>
       <w:r>
-        <w:rPr>
-          <w:sz w:val="22"/>
-        </w:rPr>
+        <w:t>lives.  OPM and Eclipse produce their output on slightly different time axes: OPM's</w:t>
       </w:r>
+    </w:p>
+    <w:p>
+      <w:r>
+        <w:t>UNSMRY integration accumulates floating-point rounding differently from Eclipse's, and the</w:t>
+      </w:r>
+    </w:p>
+    <w:p>
+      <w:r>
+        <w:t>INTEHEAD date integers in the UNRST binary need to be decoded and matched to Eclipse's</w:t>
+      </w:r>
+    </w:p>
+    <w:p>
+      <w:r>
+        <w:t>restart schedule.  The agent handles both — linearly interpolating the OPM UNSMRY vectors</w:t>
+      </w:r>
+    </w:p>
+    <w:p>
+      <w:r>
+        <w:t>onto Eclipse's 127-point time axis, and optionally loading Eclipse's UNRST binary for</w:t>
+      </w:r>
+    </w:p>
+    <w:p>
+      <w:r>
+        <w:t>cell-level comparison if supplied.  It then serialises everything to a single `.npz` file.</w:t>
+      </w:r>
+    </w:p>
+    <w:p>
+      <w:r>
+        <w:t>The reason for serialising rather than keeping arrays in memory is that downstream agents</w:t>
+      </w:r>
+    </w:p>
+    <w:p>
+      <w:r>
+        <w:t>need to be restartable: if the visualisation step fails, you do not want to re-run the</w:t>
+      </w:r>
+    </w:p>
+    <w:p>
+      <w:r>
+        <w:t>parser.</w:t>
+      </w:r>
+    </w:p>
+    <w:p>
+      <w:r/>
       <w:r>
         <w:rPr>
           <w:b/>
-          <w:sz w:val="22"/>
         </w:rPr>
         <w:t>Agent 4 — Metrics.</w:t>
       </w:r>
       <w:r>
-        <w:rPr>
-          <w:sz w:val="22"/>
-        </w:rPr>
-        <w:t xml:space="preserve">  R² alone is not enough.  A simulator that produces systematically 10% higher values with perfect shape gets R²=1.0 but is physically wrong.  The agent computes R², RMSE, P95 absolute error, MAPE (for cumulative vectors where near-zero values do not distort the percentage), normalised bias (as a percentage of the Eclipse mean), and within-tolerance rate.  Everything goes to a CSV.  The pass criterion is R² &gt;= 0.99: tight enough to be meaningful, lenient enough to account for the genuine algorithmic differences between the two solvers.</w:t>
+        <w:t xml:space="preserve">  R² alone is not enough.  A simulator that produces systematically</w:t>
       </w:r>
     </w:p>
     <w:p>
-      <w:pPr>
-        <w:jc w:val="left"/>
-      </w:pPr>
       <w:r>
-        <w:rPr>
-          <w:sz w:val="22"/>
-        </w:rPr>
+        <w:t>10% higher values with perfect shape gets R²=1.0 but is physically wrong.  The agent</w:t>
       </w:r>
+    </w:p>
+    <w:p>
+      <w:r>
+        <w:t>computes R², RMSE, P95 absolute error, MAPE (for cumulative vectors where near-zero values</w:t>
+      </w:r>
+    </w:p>
+    <w:p>
+      <w:r>
+        <w:t>do not distort the percentage), normalised bias (as a percentage of the Eclipse mean), and</w:t>
+      </w:r>
+    </w:p>
+    <w:p>
+      <w:r>
+        <w:t>within-tolerance rate.  Everything goes to a CSV.  The pass criterion is R² &gt;= 0.99: tight</w:t>
+      </w:r>
+    </w:p>
+    <w:p>
+      <w:r>
+        <w:t>enough to be meaningful, lenient enough to account for the genuine algorithmic differences</w:t>
+      </w:r>
+    </w:p>
+    <w:p>
+      <w:r>
+        <w:t>between the two solvers.</w:t>
+      </w:r>
+    </w:p>
+    <w:p>
+      <w:r/>
       <w:r>
         <w:rPr>
           <w:b/>
-          <w:sz w:val="22"/>
         </w:rPr>
         <w:t>Agent 5 — Visualise.</w:t>
       </w:r>
       <w:r>
-        <w:rPr>
-          <w:sz w:val="22"/>
-        </w:rPr>
-        <w:t xml:space="preserve">  Five figures are generated automatically: the field rate and cumulative comparison with forward prediction, a concordance scatter for each field-level rate vector, cell-level error distributions, an AI/ML metrics dashboard, and a pipeline performance dashboard.  The reason to automate the figures — rather than generating them manually once — is reproducibility.  If the model is updated or re-run, the figures regenerate from the same code with no manual intervention.</w:t>
+        <w:t xml:space="preserve">  Five figures are generated automatically: the field rate and</w:t>
       </w:r>
     </w:p>
     <w:p>
-      <w:pPr>
-        <w:jc w:val="left"/>
-      </w:pPr>
       <w:r>
-        <w:rPr>
-          <w:sz w:val="22"/>
-        </w:rPr>
+        <w:t>cumulative comparison with forward prediction, a concordance scatter for each field-level</w:t>
       </w:r>
+    </w:p>
+    <w:p>
+      <w:r>
+        <w:t>rate vector, cell-level error distributions, an AI/ML metrics dashboard, and a pipeline</w:t>
+      </w:r>
+    </w:p>
+    <w:p>
+      <w:r>
+        <w:t>performance dashboard.  The reason to automate the figures — rather than generating them</w:t>
+      </w:r>
+    </w:p>
+    <w:p>
+      <w:r>
+        <w:t>manually once — is reproducibility.  If the model is updated or re-run, the figures</w:t>
+      </w:r>
+    </w:p>
+    <w:p>
+      <w:r>
+        <w:t>regenerate from the same code with no manual intervention.</w:t>
+      </w:r>
+    </w:p>
+    <w:p>
+      <w:r/>
       <w:r>
         <w:rPr>
           <w:b/>
-          <w:sz w:val="22"/>
         </w:rPr>
         <w:t>Agent 6 — Build clean OPM deck.</w:t>
       </w:r>
       <w:r>
-        <w:rPr>
-          <w:sz w:val="22"/>
-        </w:rPr>
-        <w:t xml:space="preserve">  The original DATA file was exported from a commercial modelling environment and contains Eclipse-specific keywords that OPM does not use: licence block declarations, memory hints, deprecated VFP formatting.  The agent removes these, adds OPM-oriented section headers, and writes a cleaner version of the deck that runs in OPM without any command-line workarounds.</w:t>
+        <w:t xml:space="preserve">  The original DATA file was exported from a commercial</w:t>
       </w:r>
     </w:p>
     <w:p>
-      <w:pPr>
-        <w:jc w:val="left"/>
-      </w:pPr>
       <w:r>
-        <w:rPr>
-          <w:sz w:val="22"/>
-        </w:rPr>
+        <w:t>modelling environment and contains Eclipse-specific keywords that OPM does not use:</w:t>
       </w:r>
+    </w:p>
+    <w:p>
+      <w:r>
+        <w:t>licence block declarations, memory hints, deprecated VFP formatting.  The agent removes</w:t>
+      </w:r>
+    </w:p>
+    <w:p>
+      <w:r>
+        <w:t>these, adds OPM-oriented section headers, and writes a cleaner version of the deck that</w:t>
+      </w:r>
+    </w:p>
+    <w:p>
+      <w:r>
+        <w:t>runs in OPM without any command-line workarounds.</w:t>
+      </w:r>
+    </w:p>
+    <w:p>
+      <w:r/>
       <w:r>
         <w:rPr>
           <w:b/>
-          <w:sz w:val="22"/>
         </w:rPr>
         <w:t>Agent 7 — Predict forward.</w:t>
       </w:r>
       <w:r>
-        <w:rPr>
-          <w:sz w:val="22"/>
-        </w:rPr>
-        <w:t xml:space="preserve">  Once validation is established, the natural question is what happens next.  The agent extends the schedule by one year beyond the historical end date, runs OPM on the extended deck, and generates the headline comparison figure: the full 10.5 years of Eclipse history, the OPM validation match overlaid on the same period, and the OPM-only prediction for the following year.  No new wells, no reservoir management changes — a pure extrapolation of the final well constraints into an undrilled future. Cumulative volumes are plotted on a secondary axis to show the integrated production trajectory alongside the instantaneous rates.</w:t>
+        <w:t xml:space="preserve">  Once validation is established, the natural question is</w:t>
       </w:r>
     </w:p>
     <w:p>
-      <w:pPr>
-        <w:jc w:val="left"/>
-      </w:pPr>
       <w:r>
-        <w:rPr>
-          <w:sz w:val="22"/>
-        </w:rPr>
+        <w:t>what happens next.  The agent extends the schedule by one year beyond the historical end</w:t>
       </w:r>
+    </w:p>
+    <w:p>
+      <w:r>
+        <w:t>date, runs OPM on the extended deck, and generates the headline comparison figure: the</w:t>
+      </w:r>
+    </w:p>
+    <w:p>
+      <w:r>
+        <w:t>full 10.5 years of Eclipse history, the OPM validation match overlaid on the same period,</w:t>
+      </w:r>
+    </w:p>
+    <w:p>
+      <w:r>
+        <w:t>and the OPM-only prediction for the following year.  No new wells, no reservoir management</w:t>
+      </w:r>
+    </w:p>
+    <w:p>
+      <w:r>
+        <w:t>changes — a pure extrapolation of the final well constraints into an undrilled future.</w:t>
+      </w:r>
+    </w:p>
+    <w:p>
+      <w:r>
+        <w:t>Cumulative volumes are plotted on a secondary axis to show the integrated production</w:t>
+      </w:r>
+    </w:p>
+    <w:p>
+      <w:r>
+        <w:t>trajectory alongside the instantaneous rates.</w:t>
+      </w:r>
+    </w:p>
+    <w:p>
+      <w:r/>
       <w:r>
         <w:rPr>
           <w:b/>
-          <w:sz w:val="22"/>
         </w:rPr>
         <w:t>Time savings.</w:t>
       </w:r>
       <w:r>
-        <w:rPr>
-          <w:sz w:val="22"/>
-        </w:rPr>
-        <w:t xml:space="preserve">  A thorough manual validation of this model — patching the DATA deck, running the simulation, exporting and aligning outputs, computing statistics across 200+ mnemonics, building comparison figures, writing a results summary — takes a senior reservoir engineer roughly three to five working days.  The agent workflow completed in 37 minutes on a standard laptop: 35 minutes of OPM simulation compute running locally on CPU, and under two minutes for all seven Python agents combined.  That is not a replacement for the engineer's judgement — it is an elimination of the mechanical assembly work that does not require it.</w:t>
+        <w:t xml:space="preserve">  A thorough manual validation of this model — patching the DATA deck,</w:t>
       </w:r>
     </w:p>
     <w:p>
-      <w:pPr>
-        <w:jc w:val="center"/>
-      </w:pPr>
       <w:r>
-        <w:t>────────────────────────────────────────────────────────────────────────</w:t>
+        <w:t>running the simulation, exporting and aligning outputs, computing statistics across 200+</w:t>
+      </w:r>
+    </w:p>
+    <w:p>
+      <w:r>
+        <w:t>mnemonics, building comparison figures, writing a results summary — takes a senior</w:t>
+      </w:r>
+    </w:p>
+    <w:p>
+      <w:r>
+        <w:t>reservoir engineer roughly three to five working days.  The agent workflow completed in</w:t>
+      </w:r>
+    </w:p>
+    <w:p>
+      <w:r>
+        <w:t>37 minutes on a standard laptop: 35 minutes of OPM simulation compute running locally on</w:t>
+      </w:r>
+    </w:p>
+    <w:p>
+      <w:r>
+        <w:t>CPU, and under two minutes for all seven Python agents combined.  That is not a</w:t>
+      </w:r>
+    </w:p>
+    <w:p>
+      <w:r>
+        <w:t>replacement for the engineer's judgement — it is an elimination of the mechanical assembly</w:t>
+      </w:r>
+    </w:p>
+    <w:p>
+      <w:r>
+        <w:t>work that does not require it.</w:t>
+      </w:r>
+    </w:p>
+    <w:p>
+      <w:r>
+        <w:t>────────────────────────────────────────────────────────────</w:t>
       </w:r>
     </w:p>
     <w:p>
@@ -439,67 +717,20 @@
       </w:r>
     </w:p>
     <w:p>
-      <w:pPr>
-        <w:jc w:val="left"/>
-      </w:pPr>
       <w:r>
-        <w:rPr>
-          <w:sz w:val="22"/>
-        </w:rPr>
         <w:t xml:space="preserve">The headline number: </w:t>
       </w:r>
       <w:r>
         <w:rPr>
           <w:b/>
-          <w:sz w:val="22"/>
         </w:rPr>
         <w:t>89% of all output mnemonics match Eclipse at R² &gt;= 0.99</w:t>
       </w:r>
+      <w:r/>
+    </w:p>
+    <w:p>
       <w:r>
-        <w:rPr>
-          <w:sz w:val="22"/>
-        </w:rPr>
-        <w:t xml:space="preserve"> (72 of 81 matched vectors).</w:t>
-      </w:r>
-    </w:p>
-    <w:p/>
-    <w:p>
-      <w:pPr>
-        <w:jc w:val="center"/>
-      </w:pPr>
-      <w:r>
-        <w:drawing>
-          <wp:inline xmlns:a="http://schemas.openxmlformats.org/drawingml/2006/main" xmlns:pic="http://schemas.openxmlformats.org/drawingml/2006/picture">
-            <wp:extent cx="5303520" cy="3948671"/>
-            <wp:docPr id="1" name="Picture 1"/>
-            <wp:cNvGraphicFramePr>
-              <a:graphicFrameLocks noChangeAspect="1"/>
-            </wp:cNvGraphicFramePr>
-            <a:graphic>
-              <a:graphicData uri="http://schemas.openxmlformats.org/drawingml/2006/picture">
-                <pic:pic>
-                  <pic:nvPicPr>
-                    <pic:cNvPr id="0" name="field_comparison_with_prediction.png"/>
-                    <pic:cNvPicPr/>
-                  </pic:nvPicPr>
-                  <pic:blipFill>
-                    <a:blip r:embed="rId9"/>
-                    <a:stretch>
-                      <a:fillRect/>
-                    </a:stretch>
-                  </pic:blipFill>
-                  <pic:spPr>
-                    <a:xfrm>
-                      <a:off x="0" y="0"/>
-                      <a:ext cx="5303520" cy="3948671"/>
-                    </a:xfrm>
-                    <a:prstGeom prst="rect"/>
-                  </pic:spPr>
-                </pic:pic>
-              </a:graphicData>
-            </a:graphic>
-          </wp:inline>
-        </w:drawing>
+        <w:t>(72 of 81 matched vectors).</w:t>
       </w:r>
     </w:p>
     <w:p>
@@ -509,61 +740,49 @@
       <w:r>
         <w:rPr>
           <w:i/>
-          <w:sz w:val="18"/>
+          <w:sz w:val="19"/>
         </w:rPr>
-        <w:t>Figure 1: Eclipse reference (solid blue), OPM validation match (dashed red), and OPM 1-year forward prediction (dotted green with shaded band).  Instantaneous rates on the primary axis; cumulative volumes on the secondary axis.  The vertical line marks the end of the validation period.  Oil, water, and gas field vectors shown.</w:t>
+        <w:t>Figure 1: Eclipse reference (solid blue), OPM validation match (dashed red), and OPM</w:t>
       </w:r>
     </w:p>
-    <w:p/>
     <w:p>
-      <w:pPr>
-        <w:jc w:val="left"/>
-      </w:pPr>
       <w:r>
-        <w:rPr>
-          <w:sz w:val="22"/>
-        </w:rPr>
-        <w:t>The concordance plot below shows each of the 127 report timesteps as a single point, plotted OPM against Eclipse, coloured by simulation time.  Points lying on the 1:1 line indicate perfect agreement.  The gas rate (R²=0.999) is effectively indistinguishable from perfect; the oil rate (R²=0.995) and water rate (R²=0.982) show slight scatter, consistent with the solver-level differences described below.</w:t>
+        <w:t>1-year forward prediction (dotted green with shaded band).  Instantaneous rates on the</w:t>
       </w:r>
     </w:p>
-    <w:p/>
     <w:p>
-      <w:pPr>
-        <w:jc w:val="center"/>
-      </w:pPr>
       <w:r>
-        <w:drawing>
-          <wp:inline xmlns:a="http://schemas.openxmlformats.org/drawingml/2006/main" xmlns:pic="http://schemas.openxmlformats.org/drawingml/2006/picture">
-            <wp:extent cx="5303520" cy="2046571"/>
-            <wp:docPr id="2" name="Picture 2"/>
-            <wp:cNvGraphicFramePr>
-              <a:graphicFrameLocks noChangeAspect="1"/>
-            </wp:cNvGraphicFramePr>
-            <a:graphic>
-              <a:graphicData uri="http://schemas.openxmlformats.org/drawingml/2006/picture">
-                <pic:pic>
-                  <pic:nvPicPr>
-                    <pic:cNvPr id="0" name="timeseries_1to1_scatter.png"/>
-                    <pic:cNvPicPr/>
-                  </pic:nvPicPr>
-                  <pic:blipFill>
-                    <a:blip r:embed="rId10"/>
-                    <a:stretch>
-                      <a:fillRect/>
-                    </a:stretch>
-                  </pic:blipFill>
-                  <pic:spPr>
-                    <a:xfrm>
-                      <a:off x="0" y="0"/>
-                      <a:ext cx="5303520" cy="2046571"/>
-                    </a:xfrm>
-                    <a:prstGeom prst="rect"/>
-                  </pic:spPr>
-                </pic:pic>
-              </a:graphicData>
-            </a:graphic>
-          </wp:inline>
-        </w:drawing>
+        <w:t>primary axis; cumulative volumes on the secondary axis.  The vertical line marks the end</w:t>
+      </w:r>
+    </w:p>
+    <w:p>
+      <w:r>
+        <w:t>of the validation period.  Oil, water, and gas field vectors shown.*</w:t>
+      </w:r>
+    </w:p>
+    <w:p>
+      <w:r>
+        <w:t>The concordance plot below shows each of the 127 report timesteps as a single point,</w:t>
+      </w:r>
+    </w:p>
+    <w:p>
+      <w:r>
+        <w:t>plotted OPM against Eclipse, coloured by simulation time.  Points lying on the 1:1 line</w:t>
+      </w:r>
+    </w:p>
+    <w:p>
+      <w:r>
+        <w:t>indicate perfect agreement.  The gas rate (R²=0.999) is effectively indistinguishable from</w:t>
+      </w:r>
+    </w:p>
+    <w:p>
+      <w:r>
+        <w:t>perfect; the oil rate (R²=0.995) and water rate (R²=0.982) show slight scatter, consistent</w:t>
+      </w:r>
+    </w:p>
+    <w:p>
+      <w:r>
+        <w:t>with the solver-level differences described below.</w:t>
       </w:r>
     </w:p>
     <w:p>
@@ -573,61 +792,64 @@
       <w:r>
         <w:rPr>
           <w:i/>
-          <w:sz w:val="18"/>
+          <w:sz w:val="19"/>
         </w:rPr>
-        <w:t>Figure 2: OPM vs Eclipse at each of the 127 report timesteps for oil, water, and gas field production rates.  Colour indicates simulation time (early = purple, late = yellow). R² values annotated per panel.</w:t>
+        <w:t>Figure 2: OPM vs Eclipse at each of the 127 report timesteps for oil, water, and gas</w:t>
       </w:r>
     </w:p>
-    <w:p/>
     <w:p>
-      <w:pPr>
-        <w:jc w:val="left"/>
-      </w:pPr>
       <w:r>
-        <w:rPr>
-          <w:sz w:val="22"/>
-        </w:rPr>
-        <w:t>The AI/ML metrics dashboard below shows three complementary perspectives on match quality. MAPE is reported only for cumulative volumes, where percentage errors are meaningful: FOPT at 1.5%, FWPT at 1.3%, and FGPT at 0.5% — all comfortably below the 2% engineering threshold.  The bias panel shows that OPM consistently under-predicts oil and water production rates by approximately 4–6%, while gas rate bias is negligible.  The within-tolerance panel shows the percentage of timesteps where rates fall within 2% of Eclipse: water achieves 75%, oil and gas 52–65%, reflecting that rate differences are concentrated at low-production periods where small absolute errors translate to large percentages.</w:t>
+        <w:t>field production rates.  Colour indicates simulation time (early = purple, late = yellow).</w:t>
       </w:r>
     </w:p>
-    <w:p/>
     <w:p>
-      <w:pPr>
-        <w:jc w:val="center"/>
-      </w:pPr>
       <w:r>
-        <w:drawing>
-          <wp:inline xmlns:a="http://schemas.openxmlformats.org/drawingml/2006/main" xmlns:pic="http://schemas.openxmlformats.org/drawingml/2006/picture">
-            <wp:extent cx="5303520" cy="5285622"/>
-            <wp:docPr id="3" name="Picture 3"/>
-            <wp:cNvGraphicFramePr>
-              <a:graphicFrameLocks noChangeAspect="1"/>
-            </wp:cNvGraphicFramePr>
-            <a:graphic>
-              <a:graphicData uri="http://schemas.openxmlformats.org/drawingml/2006/picture">
-                <pic:pic>
-                  <pic:nvPicPr>
-                    <pic:cNvPr id="0" name="metrics_visual.png"/>
-                    <pic:cNvPicPr/>
-                  </pic:nvPicPr>
-                  <pic:blipFill>
-                    <a:blip r:embed="rId11"/>
-                    <a:stretch>
-                      <a:fillRect/>
-                    </a:stretch>
-                  </pic:blipFill>
-                  <pic:spPr>
-                    <a:xfrm>
-                      <a:off x="0" y="0"/>
-                      <a:ext cx="5303520" cy="5285622"/>
-                    </a:xfrm>
-                    <a:prstGeom prst="rect"/>
-                  </pic:spPr>
-                </pic:pic>
-              </a:graphicData>
-            </a:graphic>
-          </wp:inline>
-        </w:drawing>
+        <w:t>R² values annotated per panel.*</w:t>
+      </w:r>
+    </w:p>
+    <w:p>
+      <w:r>
+        <w:t>The AI/ML metrics dashboard below shows three complementary perspectives on match quality.</w:t>
+      </w:r>
+    </w:p>
+    <w:p>
+      <w:r>
+        <w:t>MAPE is reported only for cumulative volumes, where percentage errors are meaningful: FOPT</w:t>
+      </w:r>
+    </w:p>
+    <w:p>
+      <w:r>
+        <w:t>at 1.5%, FWPT at 1.3%, and FGPT at 0.5% — all comfortably below the 2% engineering</w:t>
+      </w:r>
+    </w:p>
+    <w:p>
+      <w:r>
+        <w:t>threshold.  The bias panel shows that OPM consistently under-predicts oil and water</w:t>
+      </w:r>
+    </w:p>
+    <w:p>
+      <w:r>
+        <w:t>production rates by approximately 4–6%, while gas rate bias is negligible.  The</w:t>
+      </w:r>
+    </w:p>
+    <w:p>
+      <w:r>
+        <w:t>within-tolerance panel shows the percentage of timesteps where rates fall within 2% of</w:t>
+      </w:r>
+    </w:p>
+    <w:p>
+      <w:r>
+        <w:t>Eclipse: water achieves 75%, oil and gas 52–65%, reflecting that rate differences are</w:t>
+      </w:r>
+    </w:p>
+    <w:p>
+      <w:r>
+        <w:t>concentrated at low-production periods where small absolute errors translate to large</w:t>
+      </w:r>
+    </w:p>
+    <w:p>
+      <w:r>
+        <w:t>percentages.</w:t>
       </w:r>
     </w:p>
     <w:p>
@@ -637,61 +859,49 @@
       <w:r>
         <w:rPr>
           <w:i/>
-          <w:sz w:val="18"/>
+          <w:sz w:val="19"/>
         </w:rPr>
-        <w:t>Figure 3: Three validation metrics across field production vectors.  Top: MAPE for cumulative volumes only (rates excluded — unreliable near zero production).  Centre: normalised mean bias error as a percentage of the Eclipse mean.  Bottom: percentage of timesteps within 2% of Eclipse.</w:t>
+        <w:t>Figure 3: Three validation metrics across field production vectors.  Top: MAPE for</w:t>
       </w:r>
     </w:p>
-    <w:p/>
     <w:p>
-      <w:pPr>
-        <w:jc w:val="left"/>
-      </w:pPr>
       <w:r>
-        <w:rPr>
-          <w:sz w:val="22"/>
-        </w:rPr>
-        <w:t>Cell-level pressure and saturation error distributions confirm that the 3D physics are being solved consistently.  The distributions shown below are computed across all 114,768 active cells and 61 restart timesteps.  Pressure residuals are centred near zero with a standard deviation of approximately 2 psia — less than the uncertainty in most pressure transient analyses.  Saturation residuals are tighter still.</w:t>
+        <w:t>cumulative volumes only (rates excluded — unreliable near zero production).  Centre:</w:t>
       </w:r>
     </w:p>
-    <w:p/>
     <w:p>
-      <w:pPr>
-        <w:jc w:val="center"/>
-      </w:pPr>
       <w:r>
-        <w:drawing>
-          <wp:inline xmlns:a="http://schemas.openxmlformats.org/drawingml/2006/main" xmlns:pic="http://schemas.openxmlformats.org/drawingml/2006/picture">
-            <wp:extent cx="5303520" cy="1886205"/>
-            <wp:docPr id="4" name="Picture 4"/>
-            <wp:cNvGraphicFramePr>
-              <a:graphicFrameLocks noChangeAspect="1"/>
-            </wp:cNvGraphicFramePr>
-            <a:graphic>
-              <a:graphicData uri="http://schemas.openxmlformats.org/drawingml/2006/picture">
-                <pic:pic>
-                  <pic:nvPicPr>
-                    <pic:cNvPr id="0" name="cell_error_distribution.png"/>
-                    <pic:cNvPicPr/>
-                  </pic:nvPicPr>
-                  <pic:blipFill>
-                    <a:blip r:embed="rId12"/>
-                    <a:stretch>
-                      <a:fillRect/>
-                    </a:stretch>
-                  </pic:blipFill>
-                  <pic:spPr>
-                    <a:xfrm>
-                      <a:off x="0" y="0"/>
-                      <a:ext cx="5303520" cy="1886205"/>
-                    </a:xfrm>
-                    <a:prstGeom prst="rect"/>
-                  </pic:spPr>
-                </pic:pic>
-              </a:graphicData>
-            </a:graphic>
-          </wp:inline>
-        </w:drawing>
+        <w:t>normalised mean bias error as a percentage of the Eclipse mean.  Bottom: percentage of</w:t>
+      </w:r>
+    </w:p>
+    <w:p>
+      <w:r>
+        <w:t>timesteps within 2% of Eclipse.*</w:t>
+      </w:r>
+    </w:p>
+    <w:p>
+      <w:r>
+        <w:t>Cell-level pressure and saturation error distributions confirm that the 3D physics are</w:t>
+      </w:r>
+    </w:p>
+    <w:p>
+      <w:r>
+        <w:t>being solved consistently.  The distributions shown below are computed across all 114,768</w:t>
+      </w:r>
+    </w:p>
+    <w:p>
+      <w:r>
+        <w:t>active cells and 61 restart timesteps.  Pressure residuals are centred near zero with a</w:t>
+      </w:r>
+    </w:p>
+    <w:p>
+      <w:r>
+        <w:t>standard deviation of approximately 2 psia — less than the uncertainty in most pressure</w:t>
+      </w:r>
+    </w:p>
+    <w:p>
+      <w:r>
+        <w:t>transient analyses.  Saturation residuals are tighter still.</w:t>
       </w:r>
     </w:p>
     <w:p>
@@ -701,83 +911,89 @@
       <w:r>
         <w:rPr>
           <w:i/>
-          <w:sz w:val="18"/>
+          <w:sz w:val="19"/>
         </w:rPr>
-        <w:t>Figure 4: Histograms of OPM minus Eclipse residuals across all cells and timesteps for pressure, water saturation, and gas saturation.  Dashed line at zero; solid line shows the mean; orange curve is the normal distribution fit.</w:t>
-      </w:r>
-    </w:p>
-    <w:p/>
-    <w:p>
-      <w:pPr>
-        <w:jc w:val="left"/>
-      </w:pPr>
-      <w:r>
-        <w:rPr>
-          <w:sz w:val="22"/>
-        </w:rPr>
-        <w:t>The 11% that do not pass at R²=0.99 are almost entirely gas lift injection rates (WGLIR) for the three wells where gas lift is active, plus water rate (WWPR) for two of those same wells.  Both simulators are internally consistent on these — OPM and Eclipse each satisfy the well's tubing head pressure constraint self-consistently, but they converge to different stable operating points on the multiphase VFP curve.  This is a known behaviour difference between the two optimisers, not a physics error, and it does not propagate to the field-level production rates that matter most for reserves estimation.  Field gas production rate and total (FGPR, FGPT) pass at R²=0.999 and R²=1.000 respectively, confirming that the gas lift optimiser difference is local to the well level.</w:t>
+        <w:t>Figure 4: Histograms of OPM minus Eclipse residuals across all cells and timesteps for</w:t>
       </w:r>
     </w:p>
     <w:p>
-      <w:pPr>
-        <w:jc w:val="left"/>
-      </w:pPr>
       <w:r>
-        <w:rPr>
-          <w:sz w:val="22"/>
-        </w:rPr>
-        <w:t>The forward prediction runs stably and produces physically plausible output: rates continuing their decline trajectory, cumulatives accumulating at a consistent pace. Nothing novel — but nothing physically unreasonable either, which is exactly what a validated free-running simulator should produce.</w:t>
+        <w:t>pressure, water saturation, and gas saturation.  Dashed line at zero; solid line shows</w:t>
       </w:r>
     </w:p>
     <w:p>
-      <w:pPr>
-        <w:jc w:val="left"/>
-      </w:pPr>
       <w:r>
-        <w:rPr>
-          <w:sz w:val="22"/>
-        </w:rPr>
-        <w:t>The pipeline performance dashboard below captures the full workflow economics.</w:t>
+        <w:t>the mean; orange curve is the normal distribution fit.*</w:t>
       </w:r>
     </w:p>
-    <w:p/>
     <w:p>
-      <w:pPr>
-        <w:jc w:val="center"/>
-      </w:pPr>
       <w:r>
-        <w:drawing>
-          <wp:inline xmlns:a="http://schemas.openxmlformats.org/drawingml/2006/main" xmlns:pic="http://schemas.openxmlformats.org/drawingml/2006/picture">
-            <wp:extent cx="5303520" cy="2578776"/>
-            <wp:docPr id="5" name="Picture 5"/>
-            <wp:cNvGraphicFramePr>
-              <a:graphicFrameLocks noChangeAspect="1"/>
-            </wp:cNvGraphicFramePr>
-            <a:graphic>
-              <a:graphicData uri="http://schemas.openxmlformats.org/drawingml/2006/picture">
-                <pic:pic>
-                  <pic:nvPicPr>
-                    <pic:cNvPr id="0" name="agent_performance.png"/>
-                    <pic:cNvPicPr/>
-                  </pic:nvPicPr>
-                  <pic:blipFill>
-                    <a:blip r:embed="rId13"/>
-                    <a:stretch>
-                      <a:fillRect/>
-                    </a:stretch>
-                  </pic:blipFill>
-                  <pic:spPr>
-                    <a:xfrm>
-                      <a:off x="0" y="0"/>
-                      <a:ext cx="5303520" cy="2578776"/>
-                    </a:xfrm>
-                    <a:prstGeom prst="rect"/>
-                  </pic:spPr>
-                </pic:pic>
-              </a:graphicData>
-            </a:graphic>
-          </wp:inline>
-        </w:drawing>
+        <w:t>The 11% that do not pass at R²=0.99 are almost entirely gas lift injection rates (WGLIR)</w:t>
+      </w:r>
+    </w:p>
+    <w:p>
+      <w:r>
+        <w:t>for the three wells where gas lift is active, plus water rate (WWPR) for two of those same</w:t>
+      </w:r>
+    </w:p>
+    <w:p>
+      <w:r>
+        <w:t>wells.  Both simulators are internally consistent on these — OPM and Eclipse each satisfy</w:t>
+      </w:r>
+    </w:p>
+    <w:p>
+      <w:r>
+        <w:t>the well's tubing head pressure constraint self-consistently, but they converge to different</w:t>
+      </w:r>
+    </w:p>
+    <w:p>
+      <w:r>
+        <w:t>stable operating points on the multiphase VFP curve.  This is a known behaviour difference</w:t>
+      </w:r>
+    </w:p>
+    <w:p>
+      <w:r>
+        <w:t>between the two optimisers, not a physics error, and it does not propagate to the</w:t>
+      </w:r>
+    </w:p>
+    <w:p>
+      <w:r>
+        <w:t>field-level production rates that matter most for reserves estimation.  Field gas production</w:t>
+      </w:r>
+    </w:p>
+    <w:p>
+      <w:r>
+        <w:t>rate and total (FGPR, FGPT) pass at R²=0.999 and R²=1.000 respectively, confirming that</w:t>
+      </w:r>
+    </w:p>
+    <w:p>
+      <w:r>
+        <w:t>the gas lift optimiser difference is local to the well level.</w:t>
+      </w:r>
+    </w:p>
+    <w:p>
+      <w:r>
+        <w:t>The forward prediction runs stably and produces physically plausible output: rates</w:t>
+      </w:r>
+    </w:p>
+    <w:p>
+      <w:r>
+        <w:t>continuing their decline trajectory, cumulatives accumulating at a consistent pace.</w:t>
+      </w:r>
+    </w:p>
+    <w:p>
+      <w:r>
+        <w:t>Nothing novel — but nothing physically unreasonable either, which is exactly what a</w:t>
+      </w:r>
+    </w:p>
+    <w:p>
+      <w:r>
+        <w:t>validated free-running simulator should produce.</w:t>
+      </w:r>
+    </w:p>
+    <w:p>
+      <w:r>
+        <w:t>The pipeline performance dashboard below captures the full workflow economics.</w:t>
       </w:r>
     </w:p>
     <w:p>
@@ -787,18 +1003,34 @@
       <w:r>
         <w:rPr>
           <w:i/>
-          <w:sz w:val="18"/>
+          <w:sz w:val="19"/>
         </w:rPr>
-        <w:t>Figure 5: Left — runtime for each of the seven agents; the two OPM simulation runs (validation and 1-year prediction) run entirely on local CPU with no token consumption. Right — OPM solver behaviour: 86.2% of timesteps solved on the first Newton attempt; the remaining 13.8% were retried after automatic step-size halving and subsequently converged.</w:t>
+        <w:t>Figure 5: Left — runtime for each of the seven agents; the two OPM simulation runs</w:t>
       </w:r>
     </w:p>
-    <w:p/>
     <w:p>
-      <w:pPr>
-        <w:jc w:val="center"/>
-      </w:pPr>
       <w:r>
-        <w:t>────────────────────────────────────────────────────────────────────────</w:t>
+        <w:t>(validation and 1-year prediction) run entirely on local CPU with no token consumption.</w:t>
+      </w:r>
+    </w:p>
+    <w:p>
+      <w:r>
+        <w:t>Right — OPM solver behaviour: 86.2% of timesteps solved on the first Newton attempt;</w:t>
+      </w:r>
+    </w:p>
+    <w:p>
+      <w:r>
+        <w:t>the remaining 13.8% were retried after automatic step-size halving and subsequently</w:t>
+      </w:r>
+    </w:p>
+    <w:p>
+      <w:r>
+        <w:t>converged.*</w:t>
+      </w:r>
+    </w:p>
+    <w:p>
+      <w:r>
+        <w:t>────────────────────────────────────────────────────────────</w:t>
       </w:r>
     </w:p>
     <w:p>
@@ -810,44 +1042,108 @@
       </w:r>
     </w:p>
     <w:p>
-      <w:pPr>
-        <w:jc w:val="left"/>
-      </w:pPr>
       <w:r>
-        <w:rPr>
-          <w:sz w:val="22"/>
-        </w:rPr>
-        <w:t>The old way of working this problem looks like this: the engineer opens the DATA file in a text editor, manually patches keywords until OPM stops crashing, runs the simulation, opens the outputs in a post-processing tool, exports to CSV, copies into a spreadsheet, builds comparison charts by hand, and writes a memo.  That process works.  It has always worked. And it produces something the automated workflow cannot — an engineer who has read every line of the DATA deck, understands why each keyword is there, and has developed an intuitive feel for where the model is sensitive and where it is not.  That kind of understanding is real and it matters.</w:t>
+        <w:t>The old way of working this problem looks like this: the engineer opens the DATA file in a</w:t>
       </w:r>
     </w:p>
     <w:p>
-      <w:pPr>
-        <w:jc w:val="left"/>
-      </w:pPr>
       <w:r>
-        <w:rPr>
-          <w:sz w:val="22"/>
-        </w:rPr>
-        <w:t>The new way automates everything up to the interpretation step.  The engineer configures a JSON file, runs one command, and gets a validated results package — CSV, figures, and a clean deck — in under 40 minutes.  The workflow is reproducible: a colleague anywhere with OPM and Python can regenerate the exact same results from the same inputs.  It is transferable: the agents document their own reasoning in code, not in someone's institutional memory.</w:t>
+        <w:t>text editor, manually patches keywords until OPM stops crashing, runs the simulation, opens</w:t>
       </w:r>
     </w:p>
     <w:p>
-      <w:pPr>
-        <w:jc w:val="left"/>
-      </w:pPr>
       <w:r>
-        <w:rPr>
-          <w:sz w:val="22"/>
-        </w:rPr>
-        <w:t>What might be lost in the transition is that enforced familiarity with the model.  When the process is manual, the engineer has to confront every quirk of the DATA deck.  When it is automated, there is a risk of treating the output as a black box and missing the physics insight buried in the non-passing mnemonics.  The right response to that risk is not to avoid automation.  It is to treat the agent output as the starting point for engineering judgement — not the end of it.</w:t>
+        <w:t>the outputs in a post-processing tool, exports to CSV, copies into a spreadsheet, builds</w:t>
       </w:r>
     </w:p>
     <w:p>
-      <w:pPr>
-        <w:jc w:val="center"/>
-      </w:pPr>
       <w:r>
-        <w:t>────────────────────────────────────────────────────────────────────────</w:t>
+        <w:t>comparison charts by hand, and writes a memo.  That process works.  It has always worked.</w:t>
+      </w:r>
+    </w:p>
+    <w:p>
+      <w:r>
+        <w:t>And it produces something the automated workflow cannot — an engineer who has read every</w:t>
+      </w:r>
+    </w:p>
+    <w:p>
+      <w:r>
+        <w:t>line of the DATA deck, understands why each keyword is there, and has developed an</w:t>
+      </w:r>
+    </w:p>
+    <w:p>
+      <w:r>
+        <w:t>intuitive feel for where the model is sensitive and where it is not.  That kind of</w:t>
+      </w:r>
+    </w:p>
+    <w:p>
+      <w:r>
+        <w:t>understanding is real and it matters.</w:t>
+      </w:r>
+    </w:p>
+    <w:p>
+      <w:r>
+        <w:t>The new way automates everything up to the interpretation step.  The engineer configures a</w:t>
+      </w:r>
+    </w:p>
+    <w:p>
+      <w:r>
+        <w:t>JSON file, runs one command, and gets a validated results package — CSV, figures, and a</w:t>
+      </w:r>
+    </w:p>
+    <w:p>
+      <w:r>
+        <w:t>clean deck — in under 40 minutes.  The workflow is reproducible: a colleague anywhere with</w:t>
+      </w:r>
+    </w:p>
+    <w:p>
+      <w:r>
+        <w:t>OPM and Python can regenerate the exact same results from the same inputs.  It is</w:t>
+      </w:r>
+    </w:p>
+    <w:p>
+      <w:r>
+        <w:t>transferable: the agents document their own reasoning in code, not in someone's</w:t>
+      </w:r>
+    </w:p>
+    <w:p>
+      <w:r>
+        <w:t>institutional memory.</w:t>
+      </w:r>
+    </w:p>
+    <w:p>
+      <w:r>
+        <w:t>What might be lost in the transition is that enforced familiarity with the model.  When the</w:t>
+      </w:r>
+    </w:p>
+    <w:p>
+      <w:r>
+        <w:t>process is manual, the engineer has to confront every quirk of the DATA deck.  When it is</w:t>
+      </w:r>
+    </w:p>
+    <w:p>
+      <w:r>
+        <w:t>automated, there is a risk of treating the output as a black box and missing the physics</w:t>
+      </w:r>
+    </w:p>
+    <w:p>
+      <w:r>
+        <w:t>insight buried in the non-passing mnemonics.  The right response to that risk is not to</w:t>
+      </w:r>
+    </w:p>
+    <w:p>
+      <w:r>
+        <w:t>avoid automation.  It is to treat the agent output as the starting point for engineering</w:t>
+      </w:r>
+    </w:p>
+    <w:p>
+      <w:r>
+        <w:t>judgement — not the end of it.</w:t>
+      </w:r>
+    </w:p>
+    <w:p>
+      <w:r>
+        <w:t>────────────────────────────────────────────────────────────</w:t>
       </w:r>
     </w:p>
     <w:p>
@@ -859,83 +1155,58 @@
       </w:r>
     </w:p>
     <w:p>
-      <w:pPr>
-        <w:jc w:val="left"/>
-      </w:pPr>
       <w:r>
-        <w:rPr>
-          <w:sz w:val="22"/>
-        </w:rPr>
-        <w:t>The full workflow is available on GitHub: [link to repository]</w:t>
+        <w:t>The full workflow is available on GitHub: https://github.com/SanmTex/Conversion-of-Eclipse-to-OPM-Black-Oil-Simulation-by-Agentic-AI-Orchestration</w:t>
       </w:r>
     </w:p>
     <w:p>
-      <w:pPr>
-        <w:jc w:val="left"/>
-      </w:pPr>
       <w:r>
-        <w:rPr>
-          <w:sz w:val="22"/>
-        </w:rPr>
-        <w:t xml:space="preserve">Clone the repo, obtain the binary data files (instructions in </w:t>
-      </w:r>
-      <w:r>
-        <w:rPr>
-          <w:rFonts w:ascii="Courier New" w:hAnsi="Courier New"/>
-          <w:sz w:val="22"/>
-        </w:rPr>
-        <w:t>data/README_DATA.md</w:t>
-      </w:r>
-      <w:r>
-        <w:rPr>
-          <w:sz w:val="22"/>
-        </w:rPr>
-        <w:t xml:space="preserve">), set your config, and run </w:t>
-      </w:r>
-      <w:r>
-        <w:rPr>
-          <w:rFonts w:ascii="Courier New" w:hAnsi="Courier New"/>
-          <w:sz w:val="22"/>
-        </w:rPr>
-        <w:t>python agents/orchestrator.py</w:t>
-      </w:r>
-      <w:r>
-        <w:rPr>
-          <w:sz w:val="22"/>
-        </w:rPr>
-        <w:t>.  The README covers prerequisites, and the notebook version (</w:t>
-      </w:r>
-      <w:r>
-        <w:rPr>
-          <w:rFonts w:ascii="Courier New" w:hAnsi="Courier New"/>
-          <w:sz w:val="22"/>
-        </w:rPr>
-        <w:t>notebooks/OPM_Validation.ipynb</w:t>
-      </w:r>
-      <w:r>
-        <w:rPr>
-          <w:sz w:val="22"/>
-        </w:rPr>
-        <w:t>) walks through each step with explanations if you prefer a more interactive approach.</w:t>
+        <w:t>Clone the repo, obtain the binary data files (instructions in `data/README_DATA.md`), set</w:t>
       </w:r>
     </w:p>
     <w:p>
-      <w:pPr>
-        <w:jc w:val="center"/>
-      </w:pPr>
       <w:r>
-        <w:t>────────────────────────────────────────────────────────────────────────</w:t>
+        <w:t>your config, and run `python agents/orchestrator.py`.  The README covers prerequisites,</w:t>
       </w:r>
     </w:p>
     <w:p>
-      <w:pPr>
-        <w:jc w:val="left"/>
-      </w:pPr>
       <w:r>
-        <w:rPr>
-          <w:sz w:val="22"/>
-        </w:rPr>
-        <w:t>If you have a portfolio of legacy Eclipse models and are weighing the cost of continued commercial licences, considering an OPM migration, or need a reproducible validation workflow for a technical submission or acquisition — this is a practical starting point. I am happy to discuss what that looks like for your specific situation.  Connect on LinkedIn if it is relevant to work you are doing.</w:t>
+        <w:t>and the notebook version (`notebooks/OPM_Validation.ipynb`) walks through each step with</w:t>
+      </w:r>
+    </w:p>
+    <w:p>
+      <w:r>
+        <w:t>explanations if you prefer a more interactive approach.</w:t>
+      </w:r>
+    </w:p>
+    <w:p>
+      <w:r>
+        <w:t>────────────────────────────────────────────────────────────</w:t>
+      </w:r>
+    </w:p>
+    <w:p>
+      <w:r>
+        <w:t>If you have a portfolio of legacy Eclipse models and are weighing the cost of continued</w:t>
+      </w:r>
+    </w:p>
+    <w:p>
+      <w:r>
+        <w:t>commercial licences, considering an OPM migration, or need a reproducible validation</w:t>
+      </w:r>
+    </w:p>
+    <w:p>
+      <w:r>
+        <w:t>workflow for a technical submission or acquisition — this is a practical starting point.</w:t>
+      </w:r>
+    </w:p>
+    <w:p>
+      <w:r>
+        <w:t>I am happy to discuss what that looks like for your specific situation.  Connect on</w:t>
+      </w:r>
+    </w:p>
+    <w:p>
+      <w:r>
+        <w:t>LinkedIn if it is relevant to work you are doing.</w:t>
       </w:r>
     </w:p>
     <w:sectPr>

</xml_diff>